<commit_message>
Update HTML and DOCX report with actual embedded headless screenshots
</commit_message>
<xml_diff>
--- a/Report_Changes_Velora.docx
+++ b/Report_Changes_Velora.docx
@@ -7,12 +7,33 @@
         <w:pStyle w:val="Title"/>
       </w:pPr>
       <w:r>
-        <w:t>Report of Changes - Velora Formazione</w:t>
+        <w:t>Velora Formazione - Client Modification Report</w:t>
       </w:r>
     </w:p>
     <w:p>
       <w:r>
-        <w:t>Below is a summary of all the requested changes that have been successfully implemented.</w:t>
+        <w:rPr>
+          <w:b/>
+        </w:rPr>
+        <w:t xml:space="preserve">Project: </w:t>
+      </w:r>
+      <w:r>
+        <w:t>Velora Formazione Website Updates</w:t>
+        <w:br/>
+      </w:r>
+      <w:r>
+        <w:rPr>
+          <w:b/>
+        </w:rPr>
+        <w:t xml:space="preserve">Date: </w:t>
+      </w:r>
+      <w:r>
+        <w:t>August 7, 2026</w:t>
+        <w:br/>
+        <w:br/>
+      </w:r>
+      <w:r>
+        <w:t>This report provides visual screenshots and details for all completed website modifications.</w:t>
       </w:r>
     </w:p>
     <w:p>
@@ -20,20 +41,53 @@
         <w:pStyle w:val="Heading2"/>
       </w:pPr>
       <w:r>
-        <w:t>1. Navbar Overlap Fix</w:t>
+        <w:t>1. Navbar Overlap Fix (Global)</w:t>
       </w:r>
     </w:p>
     <w:p>
       <w:r>
-        <w:t>Added global CSS padding to prevent the new pill navigation bar from overlapping the top section content on all pages.</w:t>
+        <w:t>Applied top padding fix to prevent the fixed pill navigation bar from overlapping the top title/hero elements across all pages.</w:t>
       </w:r>
     </w:p>
     <w:p>
       <w:r>
-        <w:rPr>
-          <w:i/>
-        </w:rPr>
-        <w:t>(Screenshot placeholder: As an AI, I cannot take live screenshots of the browser, but you can paste your screenshots here for the final client report.)</w:t>
+        <w:drawing>
+          <wp:inline xmlns:a="http://schemas.openxmlformats.org/drawingml/2006/main" xmlns:pic="http://schemas.openxmlformats.org/drawingml/2006/picture">
+            <wp:extent cx="5486400" cy="3429000"/>
+            <wp:docPr id="1" name="Picture 1"/>
+            <wp:cNvGraphicFramePr>
+              <a:graphicFrameLocks noChangeAspect="1"/>
+            </wp:cNvGraphicFramePr>
+            <a:graphic>
+              <a:graphicData uri="http://schemas.openxmlformats.org/drawingml/2006/picture">
+                <pic:pic>
+                  <pic:nvPicPr>
+                    <pic:cNvPr id="0" name="screenshot_navbar.png"/>
+                    <pic:cNvPicPr/>
+                  </pic:nvPicPr>
+                  <pic:blipFill>
+                    <a:blip r:embed="rId9"/>
+                    <a:stretch>
+                      <a:fillRect/>
+                    </a:stretch>
+                  </pic:blipFill>
+                  <pic:spPr>
+                    <a:xfrm>
+                      <a:off x="0" y="0"/>
+                      <a:ext cx="5486400" cy="3429000"/>
+                    </a:xfrm>
+                    <a:prstGeom prst="rect"/>
+                  </pic:spPr>
+                </pic:pic>
+              </a:graphicData>
+            </a:graphic>
+          </wp:inline>
+        </w:drawing>
+      </w:r>
+    </w:p>
+    <w:p>
+      <w:r>
+        <w:br/>
       </w:r>
     </w:p>
     <w:p>
@@ -41,20 +95,53 @@
         <w:pStyle w:val="Heading2"/>
       </w:pPr>
       <w:r>
-        <w:t>2. Removed Booking Form (Italian Exams)</w:t>
+        <w:t>2. Master CAF - Bergamo Location &amp; Form Removal</w:t>
       </w:r>
     </w:p>
     <w:p>
       <w:r>
-        <w:t>Completely removed the 'Fill Out the Booking Form' section from esame_italiano.html and updated button links to point to '#' until a new link is provided.</w:t>
+        <w:t>Updated location badge to 'BERGAMO', changed location bullet point to 'Sede a Bergamo', and completely removed the bottom registration form section.</w:t>
       </w:r>
     </w:p>
     <w:p>
       <w:r>
-        <w:rPr>
-          <w:i/>
-        </w:rPr>
-        <w:t>(Screenshot placeholder: As an AI, I cannot take live screenshots of the browser, but you can paste your screenshots here for the final client report.)</w:t>
+        <w:drawing>
+          <wp:inline xmlns:a="http://schemas.openxmlformats.org/drawingml/2006/main" xmlns:pic="http://schemas.openxmlformats.org/drawingml/2006/picture">
+            <wp:extent cx="5486400" cy="6000750"/>
+            <wp:docPr id="2" name="Picture 2"/>
+            <wp:cNvGraphicFramePr>
+              <a:graphicFrameLocks noChangeAspect="1"/>
+            </wp:cNvGraphicFramePr>
+            <a:graphic>
+              <a:graphicData uri="http://schemas.openxmlformats.org/drawingml/2006/picture">
+                <pic:pic>
+                  <pic:nvPicPr>
+                    <pic:cNvPr id="0" name="screenshot_master_caf.png"/>
+                    <pic:cNvPicPr/>
+                  </pic:nvPicPr>
+                  <pic:blipFill>
+                    <a:blip r:embed="rId10"/>
+                    <a:stretch>
+                      <a:fillRect/>
+                    </a:stretch>
+                  </pic:blipFill>
+                  <pic:spPr>
+                    <a:xfrm>
+                      <a:off x="0" y="0"/>
+                      <a:ext cx="5486400" cy="6000750"/>
+                    </a:xfrm>
+                    <a:prstGeom prst="rect"/>
+                  </pic:spPr>
+                </pic:pic>
+              </a:graphicData>
+            </a:graphic>
+          </wp:inline>
+        </w:drawing>
+      </w:r>
+    </w:p>
+    <w:p>
+      <w:r>
+        <w:br/>
       </w:r>
     </w:p>
     <w:p>
@@ -62,20 +149,53 @@
         <w:pStyle w:val="Heading2"/>
       </w:pPr>
       <w:r>
-        <w:t>3. Removed Application Form (Master CAF)</w:t>
+        <w:t>3. Italian Language Exams - Form Removal</w:t>
       </w:r>
     </w:p>
     <w:p>
       <w:r>
-        <w:t>Completely removed the 'Candidati e Compila il Modulo' form section from master_caf.html and updated the button links accordingly.</w:t>
+        <w:t>Completely removed the 'Fill Out the Booking Form' section from the Italian Language Exam page.</w:t>
       </w:r>
     </w:p>
     <w:p>
       <w:r>
-        <w:rPr>
-          <w:i/>
-        </w:rPr>
-        <w:t>(Screenshot placeholder: As an AI, I cannot take live screenshots of the browser, but you can paste your screenshots here for the final client report.)</w:t>
+        <w:drawing>
+          <wp:inline xmlns:a="http://schemas.openxmlformats.org/drawingml/2006/main" xmlns:pic="http://schemas.openxmlformats.org/drawingml/2006/picture">
+            <wp:extent cx="5486400" cy="5143500"/>
+            <wp:docPr id="3" name="Picture 3"/>
+            <wp:cNvGraphicFramePr>
+              <a:graphicFrameLocks noChangeAspect="1"/>
+            </wp:cNvGraphicFramePr>
+            <a:graphic>
+              <a:graphicData uri="http://schemas.openxmlformats.org/drawingml/2006/picture">
+                <pic:pic>
+                  <pic:nvPicPr>
+                    <pic:cNvPr id="0" name="screenshot_esame_italiano.png"/>
+                    <pic:cNvPicPr/>
+                  </pic:nvPicPr>
+                  <pic:blipFill>
+                    <a:blip r:embed="rId11"/>
+                    <a:stretch>
+                      <a:fillRect/>
+                    </a:stretch>
+                  </pic:blipFill>
+                  <pic:spPr>
+                    <a:xfrm>
+                      <a:off x="0" y="0"/>
+                      <a:ext cx="5486400" cy="5143500"/>
+                    </a:xfrm>
+                    <a:prstGeom prst="rect"/>
+                  </pic:spPr>
+                </pic:pic>
+              </a:graphicData>
+            </a:graphic>
+          </wp:inline>
+        </w:drawing>
+      </w:r>
+    </w:p>
+    <w:p>
+      <w:r>
+        <w:br/>
       </w:r>
     </w:p>
     <w:p>
@@ -83,20 +203,53 @@
         <w:pStyle w:val="Heading2"/>
       </w:pPr>
       <w:r>
-        <w:t>4. Updated Location to Bergamo</w:t>
+        <w:t>4. About Us - Experience Years Updated</w:t>
       </w:r>
     </w:p>
     <w:p>
       <w:r>
-        <w:t>Changed 'Sede comoda in centro a Milano (Via Guido Mazzali 5)' to 'Sede a Bergamo' and updated the location badge from 'MILANO' to 'BERGAMO' in the Master CAF page.</w:t>
+        <w:t>Updated experience statistic from 10+ Anni to 5+ Anni in Chi Siamo page.</w:t>
       </w:r>
     </w:p>
     <w:p>
       <w:r>
-        <w:rPr>
-          <w:i/>
-        </w:rPr>
-        <w:t>(Screenshot placeholder: As an AI, I cannot take live screenshots of the browser, but you can paste your screenshots here for the final client report.)</w:t>
+        <w:drawing>
+          <wp:inline xmlns:a="http://schemas.openxmlformats.org/drawingml/2006/main" xmlns:pic="http://schemas.openxmlformats.org/drawingml/2006/picture">
+            <wp:extent cx="5486400" cy="4286250"/>
+            <wp:docPr id="4" name="Picture 4"/>
+            <wp:cNvGraphicFramePr>
+              <a:graphicFrameLocks noChangeAspect="1"/>
+            </wp:cNvGraphicFramePr>
+            <a:graphic>
+              <a:graphicData uri="http://schemas.openxmlformats.org/drawingml/2006/picture">
+                <pic:pic>
+                  <pic:nvPicPr>
+                    <pic:cNvPr id="0" name="screenshot_chi_siamo.png"/>
+                    <pic:cNvPicPr/>
+                  </pic:nvPicPr>
+                  <pic:blipFill>
+                    <a:blip r:embed="rId12"/>
+                    <a:stretch>
+                      <a:fillRect/>
+                    </a:stretch>
+                  </pic:blipFill>
+                  <pic:spPr>
+                    <a:xfrm>
+                      <a:off x="0" y="0"/>
+                      <a:ext cx="5486400" cy="4286250"/>
+                    </a:xfrm>
+                    <a:prstGeom prst="rect"/>
+                  </pic:spPr>
+                </pic:pic>
+              </a:graphicData>
+            </a:graphic>
+          </wp:inline>
+        </w:drawing>
+      </w:r>
+    </w:p>
+    <w:p>
+      <w:r>
+        <w:br/>
       </w:r>
     </w:p>
     <w:p>
@@ -104,62 +257,53 @@
         <w:pStyle w:val="Heading2"/>
       </w:pPr>
       <w:r>
-        <w:t>5. Removed '4' from Installments Text</w:t>
+        <w:t>5. Calendar &amp; Course Dates Updated</w:t>
       </w:r>
     </w:p>
     <w:p>
       <w:r>
-        <w:t>Updated 'Finanziamento Agevolato in 4 Rate Disponibile' to 'Finanziamento Agevolato a Rate Disponibile' across all translations.</w:t>
+        <w:t>Updated start date to 19 SETTEMBRE and updated seat limit label to 'Numero Chiuso (Posti limitati)'.</w:t>
       </w:r>
     </w:p>
     <w:p>
       <w:r>
-        <w:rPr>
-          <w:i/>
-        </w:rPr>
-        <w:t>(Screenshot placeholder: As an AI, I cannot take live screenshots of the browser, but you can paste your screenshots here for the final client report.)</w:t>
-      </w:r>
-    </w:p>
-    <w:p>
-      <w:pPr>
-        <w:pStyle w:val="Heading2"/>
-      </w:pPr>
-      <w:r>
-        <w:t>6. '10+ Years' changed to '5+ Years'</w:t>
+        <w:drawing>
+          <wp:inline xmlns:a="http://schemas.openxmlformats.org/drawingml/2006/main" xmlns:pic="http://schemas.openxmlformats.org/drawingml/2006/picture">
+            <wp:extent cx="5486400" cy="4714875"/>
+            <wp:docPr id="5" name="Picture 5"/>
+            <wp:cNvGraphicFramePr>
+              <a:graphicFrameLocks noChangeAspect="1"/>
+            </wp:cNvGraphicFramePr>
+            <a:graphic>
+              <a:graphicData uri="http://schemas.openxmlformats.org/drawingml/2006/picture">
+                <pic:pic>
+                  <pic:nvPicPr>
+                    <pic:cNvPr id="0" name="screenshot_calendario.png"/>
+                    <pic:cNvPicPr/>
+                  </pic:nvPicPr>
+                  <pic:blipFill>
+                    <a:blip r:embed="rId13"/>
+                    <a:stretch>
+                      <a:fillRect/>
+                    </a:stretch>
+                  </pic:blipFill>
+                  <pic:spPr>
+                    <a:xfrm>
+                      <a:off x="0" y="0"/>
+                      <a:ext cx="5486400" cy="4714875"/>
+                    </a:xfrm>
+                    <a:prstGeom prst="rect"/>
+                  </pic:spPr>
+                </pic:pic>
+              </a:graphicData>
+            </a:graphic>
+          </wp:inline>
+        </w:drawing>
       </w:r>
     </w:p>
     <w:p>
       <w:r>
-        <w:t>Updated the statistics text in the About Us page from 10+ Anni to 5+ Anni.</w:t>
-      </w:r>
-    </w:p>
-    <w:p>
-      <w:r>
-        <w:rPr>
-          <w:i/>
-        </w:rPr>
-        <w:t>(Screenshot placeholder: As an AI, I cannot take live screenshots of the browser, but you can paste your screenshots here for the final client report.)</w:t>
-      </w:r>
-    </w:p>
-    <w:p>
-      <w:pPr>
-        <w:pStyle w:val="Heading2"/>
-      </w:pPr>
-      <w:r>
-        <w:t>7. Replaced 'Max 20' with 'Limited Number'</w:t>
-      </w:r>
-    </w:p>
-    <w:p>
-      <w:r>
-        <w:t>Updated 'Numero Chiuso (Max 20)' to 'Numero Chiuso (Posti limitati)' in the translations.</w:t>
-      </w:r>
-    </w:p>
-    <w:p>
-      <w:r>
-        <w:rPr>
-          <w:i/>
-        </w:rPr>
-        <w:t>(Screenshot placeholder: As an AI, I cannot take live screenshots of the browser, but you can paste your screenshots here for the final client report.)</w:t>
+        <w:br/>
       </w:r>
     </w:p>
     <w:sectPr>

</xml_diff>